<commit_message>
Add v2 pipeline modules and update frontend/backend
- Add new v2 pipeline steps: analyzeJdDeep, analyzeProfile, buildStrategy, generateAchievements, generateExperience, generateSkills, generateSummary, reviewResume, verifyCoverage, and types
- Update v2 pipeline index, convertToJson, backend index, and resume template
- Update Home.jsx and api.js on frontend

Co-Authored-By: Claude Opus 4.6 <noreply@anthropic.com>
</commit_message>
<xml_diff>
--- a/backend/src/templates/resume-template.docx
+++ b/backend/src/templates/resume-template.docx
@@ -95,8 +95,9 @@
           <w:sz w:val="20"/>
           <w:szCs w:val="20"/>
         </w:rPr>
-        <w:t>{phone}</w:t>
-      </w:r>
+        <w:t>{</w:t>
+      </w:r>
+      <w:proofErr w:type="gramStart"/>
       <w:r>
         <w:rPr>
           <w:rFonts w:cstheme="minorHAnsi"/>
@@ -104,8 +105,18 @@
           <w:sz w:val="20"/>
           <w:szCs w:val="20"/>
         </w:rPr>
+        <w:t>phone}</w:t>
+      </w:r>
+      <w:r>
+        <w:rPr>
+          <w:rFonts w:cstheme="minorHAnsi"/>
+          <w:color w:val="363A45" w:themeColor="text1" w:themeTint="E6"/>
+          <w:sz w:val="20"/>
+          <w:szCs w:val="20"/>
+        </w:rPr>
         <w:t xml:space="preserve">   </w:t>
       </w:r>
+      <w:proofErr w:type="gramEnd"/>
       <w:r>
         <w:rPr>
           <w:rFonts w:cstheme="minorHAnsi"/>
@@ -143,8 +154,9 @@
           <w:sz w:val="20"/>
           <w:szCs w:val="20"/>
         </w:rPr>
-        <w:t>{location}</w:t>
-      </w:r>
+        <w:t>{</w:t>
+      </w:r>
+      <w:proofErr w:type="gramStart"/>
       <w:r>
         <w:rPr>
           <w:rFonts w:cstheme="minorHAnsi"/>
@@ -152,7 +164,26 @@
           <w:sz w:val="20"/>
           <w:szCs w:val="20"/>
         </w:rPr>
-        <w:t xml:space="preserve">    </w:t>
+        <w:t>location}</w:t>
+      </w:r>
+      <w:r>
+        <w:rPr>
+          <w:rFonts w:cstheme="minorHAnsi"/>
+          <w:color w:val="363A45" w:themeColor="text1" w:themeTint="E6"/>
+          <w:sz w:val="20"/>
+          <w:szCs w:val="20"/>
+        </w:rPr>
+        <w:t xml:space="preserve">   </w:t>
+      </w:r>
+      <w:proofErr w:type="gramEnd"/>
+      <w:r>
+        <w:rPr>
+          <w:rFonts w:cstheme="minorHAnsi"/>
+          <w:color w:val="363A45" w:themeColor="text1" w:themeTint="E6"/>
+          <w:sz w:val="20"/>
+          <w:szCs w:val="20"/>
+        </w:rPr>
+        <w:t xml:space="preserve"> </w:t>
       </w:r>
       <w:r>
         <w:rPr>
@@ -170,8 +201,9 @@
           <w:sz w:val="20"/>
           <w:szCs w:val="20"/>
         </w:rPr>
-        <w:t xml:space="preserve">{email} </w:t>
-      </w:r>
+        <w:t>{</w:t>
+      </w:r>
+      <w:proofErr w:type="gramStart"/>
       <w:r>
         <w:rPr>
           <w:rFonts w:cstheme="minorHAnsi"/>
@@ -179,7 +211,26 @@
           <w:sz w:val="20"/>
           <w:szCs w:val="20"/>
         </w:rPr>
-        <w:t xml:space="preserve">   </w:t>
+        <w:t xml:space="preserve">email} </w:t>
+      </w:r>
+      <w:r>
+        <w:rPr>
+          <w:rFonts w:cstheme="minorHAnsi"/>
+          <w:color w:val="363A45" w:themeColor="text1" w:themeTint="E6"/>
+          <w:sz w:val="20"/>
+          <w:szCs w:val="20"/>
+        </w:rPr>
+        <w:t xml:space="preserve">  </w:t>
+      </w:r>
+      <w:proofErr w:type="gramEnd"/>
+      <w:r>
+        <w:rPr>
+          <w:rFonts w:cstheme="minorHAnsi"/>
+          <w:color w:val="363A45" w:themeColor="text1" w:themeTint="E6"/>
+          <w:sz w:val="20"/>
+          <w:szCs w:val="20"/>
+        </w:rPr>
+        <w:t xml:space="preserve"> </w:t>
       </w:r>
       <w:r>
         <w:rPr>
@@ -340,6 +391,98 @@
           <w:sz w:val="24"/>
           <w:szCs w:val="24"/>
         </w:rPr>
+        <w:t>KEY ACHIEVEMENTS</w:t>
+      </w:r>
+    </w:p>
+    <w:p>
+      <w:pPr>
+        <w:tabs>
+          <w:tab w:val="right" w:pos="10080"/>
+        </w:tabs>
+        <w:spacing w:after="0" w:line="240" w:lineRule="auto"/>
+        <w:rPr>
+          <w:rFonts w:cstheme="minorHAnsi"/>
+          <w:color w:val="363A45" w:themeColor="text1" w:themeTint="E6"/>
+        </w:rPr>
+      </w:pPr>
+      <w:r>
+        <w:rPr>
+          <w:rFonts w:cstheme="minorHAnsi"/>
+          <w:color w:val="363A45" w:themeColor="text1" w:themeTint="E6"/>
+        </w:rPr>
+        <w:t>{#achievements}</w:t>
+      </w:r>
+    </w:p>
+    <w:p>
+      <w:pPr>
+        <w:tabs>
+          <w:tab w:val="right" w:pos="10080"/>
+        </w:tabs>
+        <w:spacing w:after="0" w:line="240" w:lineRule="auto"/>
+        <w:rPr>
+          <w:rFonts w:cstheme="minorHAnsi"/>
+          <w:color w:val="363A45" w:themeColor="text1" w:themeTint="E6"/>
+        </w:rPr>
+      </w:pPr>
+      <w:r>
+        <w:rPr>
+          <w:rFonts w:cstheme="minorHAnsi"/>
+          <w:color w:val="363A45" w:themeColor="text1" w:themeTint="E6"/>
+        </w:rPr>
+        <w:t>{@rawXml}</w:t>
+      </w:r>
+    </w:p>
+    <w:p>
+      <w:pPr>
+        <w:tabs>
+          <w:tab w:val="right" w:pos="10080"/>
+        </w:tabs>
+        <w:spacing w:after="0" w:line="240" w:lineRule="auto"/>
+        <w:rPr>
+          <w:rFonts w:cstheme="minorHAnsi"/>
+          <w:color w:val="363A45" w:themeColor="text1" w:themeTint="E6"/>
+        </w:rPr>
+      </w:pPr>
+      <w:r>
+        <w:rPr>
+          <w:rFonts w:cstheme="minorHAnsi"/>
+          <w:color w:val="363A45" w:themeColor="text1" w:themeTint="E6"/>
+        </w:rPr>
+        <w:t>{/achievements}</w:t>
+      </w:r>
+    </w:p>
+    <w:p>
+      <w:pPr>
+        <w:spacing w:after="0"/>
+        <w:rPr>
+          <w:rFonts w:cstheme="minorHAnsi"/>
+          <w:color w:val="656B72" w:themeColor="text2"/>
+          <w:sz w:val="20"/>
+          <w:szCs w:val="20"/>
+        </w:rPr>
+      </w:pPr>
+    </w:p>
+    <w:p>
+      <w:pPr>
+        <w:spacing w:after="0" w:line="360" w:lineRule="auto"/>
+        <w:rPr>
+          <w:rFonts w:cstheme="minorHAnsi"/>
+          <w:b/>
+          <w:bCs/>
+          <w:color w:val="2B6DC0"/>
+          <w:sz w:val="24"/>
+          <w:szCs w:val="24"/>
+        </w:rPr>
+      </w:pPr>
+      <w:r>
+        <w:rPr>
+          <w:rFonts w:cstheme="minorHAnsi"/>
+          <w:b/>
+          <w:bCs/>
+          <w:color w:val="2B6DC0"/>
+          <w:sz w:val="24"/>
+          <w:szCs w:val="24"/>
+        </w:rPr>
         <w:t>EDUCATION</w:t>
       </w:r>
     </w:p>
@@ -361,7 +504,15 @@
           <w:rFonts w:cstheme="minorHAnsi"/>
           <w:color w:val="363A45" w:themeColor="text1" w:themeTint="E6"/>
         </w:rPr>
-        <w:t>{#education}</w:t>
+        <w:t>{#</w:t>
+      </w:r>
+      <w:proofErr w:type="gramStart"/>
+      <w:r>
+        <w:rPr>
+          <w:rFonts w:cstheme="minorHAnsi"/>
+          <w:color w:val="363A45" w:themeColor="text1" w:themeTint="E6"/>
+        </w:rPr>
+        <w:t>education}</w:t>
       </w:r>
       <w:r>
         <w:rPr>
@@ -370,7 +521,17 @@
           <w:bCs/>
           <w:color w:val="363A45" w:themeColor="text1" w:themeTint="E6"/>
         </w:rPr>
-        <w:t>{program}</w:t>
+        <w:t>{</w:t>
+      </w:r>
+      <w:proofErr w:type="gramEnd"/>
+      <w:r>
+        <w:rPr>
+          <w:rFonts w:cstheme="minorHAnsi"/>
+          <w:b/>
+          <w:bCs/>
+          <w:color w:val="363A45" w:themeColor="text1" w:themeTint="E6"/>
+        </w:rPr>
+        <w:t>program}</w:t>
       </w:r>
       <w:r>
         <w:rPr>
@@ -783,25 +944,16 @@
       <w:r>
         <w:rPr>
           <w:rFonts w:cstheme="minorHAnsi"/>
-          <w:b/>
-          <w:bCs/>
-          <w:color w:val="363A45" w:themeColor="text1" w:themeTint="E6"/>
-        </w:rPr>
-        <w:t>{section}</w:t>
-      </w:r>
-      <w:r>
-        <w:rPr>
-          <w:rFonts w:cstheme="minorHAnsi"/>
-          <w:color w:val="363A45" w:themeColor="text1" w:themeTint="E6"/>
-        </w:rPr>
-        <w:t xml:space="preserve">: </w:t>
-      </w:r>
-      <w:r>
-        <w:rPr>
-          <w:rFonts w:cstheme="minorHAnsi"/>
           <w:color w:val="363A45" w:themeColor="text1" w:themeTint="E6"/>
         </w:rPr>
         <w:t>{</w:t>
+      </w:r>
+      <w:r>
+        <w:rPr>
+          <w:rFonts w:cstheme="minorHAnsi"/>
+          <w:color w:val="363A45" w:themeColor="text1" w:themeTint="E6"/>
+        </w:rPr>
+        <w:t>@</w:t>
       </w:r>
       <w:r>
         <w:rPr>
@@ -2250,7 +2402,6 @@
   <w:style w:type="character" w:default="1" w:styleId="DefaultParagraphFont">
     <w:name w:val="Default Paragraph Font"/>
     <w:uiPriority w:val="1"/>
-    <w:semiHidden/>
     <w:unhideWhenUsed/>
   </w:style>
   <w:style w:type="table" w:default="1" w:styleId="TableNormal">

</xml_diff>

<commit_message>
Add toggles for Key Achievements and Hobbies resume sections
Users can now toggle Key Achievements and Hobbies & Interests sections
on/off from Profile preferences. Settings persist in localStorage and
are passed through to the backend template rendering.

Co-Authored-By: Claude Opus 4.6 (1M context) <noreply@anthropic.com>
</commit_message>
<xml_diff>
--- a/backend/src/templates/resume-template.docx
+++ b/backend/src/templates/resume-template.docx
@@ -391,6 +391,17 @@
           <w:sz w:val="24"/>
           <w:szCs w:val="24"/>
         </w:rPr>
+        <w:t>{#showAchievements}</w:t>
+      </w:r>
+      <w:r>
+        <w:rPr>
+          <w:rFonts w:cstheme="minorHAnsi"/>
+          <w:b/>
+          <w:bCs/>
+          <w:color w:val="2B6DC0"/>
+          <w:sz w:val="24"/>
+          <w:szCs w:val="24"/>
+        </w:rPr>
         <w:t>KEY ACHIEVEMENTS</w:t>
       </w:r>
     </w:p>
@@ -437,18 +448,56 @@
         <w:tabs>
           <w:tab w:val="right" w:pos="10080"/>
         </w:tabs>
-        <w:spacing w:after="0" w:line="240" w:lineRule="auto"/>
-        <w:rPr>
-          <w:rFonts w:cstheme="minorHAnsi"/>
-          <w:color w:val="363A45" w:themeColor="text1" w:themeTint="E6"/>
-        </w:rPr>
-      </w:pPr>
-      <w:r>
-        <w:rPr>
-          <w:rFonts w:cstheme="minorHAnsi"/>
-          <w:color w:val="363A45" w:themeColor="text1" w:themeTint="E6"/>
-        </w:rPr>
-        <w:t>{/achievements}</w:t>
+        <w:rPr>
+          <w:rFonts w:cstheme="minorHAnsi"/>
+          <w:color w:val="363A45" w:themeColor="text1" w:themeTint="E6"/>
+        </w:rPr>
+      </w:pPr>
+      <w:r>
+        <w:rPr>
+          <w:rFonts w:cstheme="minorHAnsi"/>
+          <w:color w:val="363A45" w:themeColor="text1" w:themeTint="E6"/>
+        </w:rPr>
+        <w:t>{/</w:t>
+      </w:r>
+      <w:proofErr w:type="gramStart"/>
+      <w:r>
+        <w:rPr>
+          <w:rFonts w:cstheme="minorHAnsi"/>
+          <w:color w:val="363A45" w:themeColor="text1" w:themeTint="E6"/>
+        </w:rPr>
+        <w:t>achievements}</w:t>
+      </w:r>
+      <w:r>
+        <w:rPr>
+          <w:rFonts w:cstheme="minorHAnsi"/>
+          <w:color w:val="363A45" w:themeColor="text1" w:themeTint="E6"/>
+        </w:rPr>
+        <w:t>{</w:t>
+      </w:r>
+      <w:proofErr w:type="gramEnd"/>
+      <w:r>
+        <w:rPr>
+          <w:rFonts w:cstheme="minorHAnsi"/>
+          <w:color w:val="363A45" w:themeColor="text1" w:themeTint="E6"/>
+        </w:rPr>
+        <w:t>/</w:t>
+      </w:r>
+      <w:proofErr w:type="spellStart"/>
+      <w:r>
+        <w:rPr>
+          <w:rFonts w:cstheme="minorHAnsi"/>
+          <w:color w:val="363A45" w:themeColor="text1" w:themeTint="E6"/>
+        </w:rPr>
+        <w:t>showAchievements</w:t>
+      </w:r>
+      <w:proofErr w:type="spellEnd"/>
+      <w:r>
+        <w:rPr>
+          <w:rFonts w:cstheme="minorHAnsi"/>
+          <w:color w:val="363A45" w:themeColor="text1" w:themeTint="E6"/>
+        </w:rPr>
+        <w:t>}</w:t>
       </w:r>
     </w:p>
     <w:p>
@@ -1018,7 +1067,42 @@
           <w:sz w:val="24"/>
           <w:szCs w:val="24"/>
         </w:rPr>
-        <w:t>HOBBIES &amp; INTERESTS</w:t>
+        <w:t>{#</w:t>
+      </w:r>
+      <w:proofErr w:type="gramStart"/>
+      <w:r>
+        <w:rPr>
+          <w:rFonts w:cstheme="minorHAnsi"/>
+          <w:b/>
+          <w:bCs/>
+          <w:color w:val="2B6DC0"/>
+          <w:sz w:val="24"/>
+          <w:szCs w:val="24"/>
+        </w:rPr>
+        <w:t>showHobbies}</w:t>
+      </w:r>
+      <w:r>
+        <w:rPr>
+          <w:rFonts w:cstheme="minorHAnsi"/>
+          <w:b/>
+          <w:bCs/>
+          <w:color w:val="2B6DC0"/>
+          <w:sz w:val="24"/>
+          <w:szCs w:val="24"/>
+        </w:rPr>
+        <w:t>HOBBIES</w:t>
+      </w:r>
+      <w:proofErr w:type="gramEnd"/>
+      <w:r>
+        <w:rPr>
+          <w:rFonts w:cstheme="minorHAnsi"/>
+          <w:b/>
+          <w:bCs/>
+          <w:color w:val="2B6DC0"/>
+          <w:sz w:val="24"/>
+          <w:szCs w:val="24"/>
+        </w:rPr>
+        <w:t xml:space="preserve"> &amp; INTERESTS</w:t>
       </w:r>
     </w:p>
     <w:p>
@@ -1172,6 +1256,8 @@
         <w:rPr>
           <w:rFonts w:cstheme="minorHAnsi"/>
           <w:color w:val="363A45" w:themeColor="text1" w:themeTint="E6"/>
+          <w:sz w:val="12"/>
+          <w:szCs w:val="12"/>
         </w:rPr>
         <w:sectPr>
           <w:type w:val="continuous"/>
@@ -1181,6 +1267,44 @@
           <w:docGrid w:linePitch="360"/>
         </w:sectPr>
       </w:pPr>
+      <w:r>
+        <w:rPr>
+          <w:rFonts w:cstheme="minorHAnsi"/>
+          <w:color w:val="363A45" w:themeColor="text1" w:themeTint="E6"/>
+          <w:sz w:val="12"/>
+          <w:szCs w:val="12"/>
+        </w:rPr>
+        <w:t xml:space="preserve"> </w:t>
+      </w:r>
+      <w:r>
+        <w:rPr>
+          <w:rFonts w:cstheme="minorHAnsi"/>
+          <w:color w:val="363A45" w:themeColor="text1" w:themeTint="E6"/>
+          <w:sz w:val="12"/>
+          <w:szCs w:val="12"/>
+        </w:rPr>
+        <w:t>{/</w:t>
+      </w:r>
+      <w:proofErr w:type="spellStart"/>
+      <w:r>
+        <w:rPr>
+          <w:rFonts w:cstheme="minorHAnsi"/>
+          <w:color w:val="363A45" w:themeColor="text1" w:themeTint="E6"/>
+          <w:sz w:val="12"/>
+          <w:szCs w:val="12"/>
+        </w:rPr>
+        <w:t>showHobbies</w:t>
+      </w:r>
+      <w:proofErr w:type="spellEnd"/>
+      <w:r>
+        <w:rPr>
+          <w:rFonts w:cstheme="minorHAnsi"/>
+          <w:color w:val="363A45" w:themeColor="text1" w:themeTint="E6"/>
+          <w:sz w:val="12"/>
+          <w:szCs w:val="12"/>
+        </w:rPr>
+        <w:t>}</w:t>
+      </w:r>
     </w:p>
     <w:p>
       <w:pPr>
@@ -2569,6 +2693,37 @@
       </w:tblBorders>
     </w:tblPr>
   </w:style>
+  <w:style w:type="paragraph" w:styleId="HTMLPreformatted">
+    <w:name w:val="HTML Preformatted"/>
+    <w:basedOn w:val="Normal"/>
+    <w:link w:val="HTMLPreformattedChar"/>
+    <w:uiPriority w:val="99"/>
+    <w:semiHidden/>
+    <w:unhideWhenUsed/>
+    <w:rsid w:val="00DC1AF5"/>
+    <w:pPr>
+      <w:spacing w:after="0" w:line="240" w:lineRule="auto"/>
+    </w:pPr>
+    <w:rPr>
+      <w:rFonts w:ascii="Consolas" w:hAnsi="Consolas"/>
+      <w:sz w:val="20"/>
+      <w:szCs w:val="20"/>
+    </w:rPr>
+  </w:style>
+  <w:style w:type="character" w:customStyle="1" w:styleId="HTMLPreformattedChar">
+    <w:name w:val="HTML Preformatted Char"/>
+    <w:basedOn w:val="DefaultParagraphFont"/>
+    <w:link w:val="HTMLPreformatted"/>
+    <w:uiPriority w:val="99"/>
+    <w:semiHidden/>
+    <w:rsid w:val="00DC1AF5"/>
+    <w:rPr>
+      <w:rFonts w:ascii="Consolas" w:hAnsi="Consolas"/>
+      <w:sz w:val="20"/>
+      <w:szCs w:val="20"/>
+      <w:lang w:val="en-US"/>
+    </w:rPr>
+  </w:style>
 </w:styles>
 </file>
 

</xml_diff>

<commit_message>
Add job tracker, dashboard, and landing page
- Job Tracker: full CRUD with stepper pipeline UI, status updates,
  activity timeline with comments, search/filter, stats cards
- Dashboard: personalized greeting, pipeline board, recent applications
  and resumes, quick actions (shown for signed-in users at /)
- Landing page: hero, features, how-it-works, CTAs (shown for guests at /)
- Backend: job_applications + job_application_events tables, 8 API routes
- Navbar: added Dashboard and Tracker links, moved Generator to /generator

Co-Authored-By: Claude Opus 4.6 (1M context) <noreply@anthropic.com>
</commit_message>
<xml_diff>
--- a/backend/src/templates/resume-template.docx
+++ b/backend/src/templates/resume-template.docx
@@ -458,36 +458,37 @@
           <w:rFonts w:cstheme="minorHAnsi"/>
           <w:color w:val="363A45" w:themeColor="text1" w:themeTint="E6"/>
         </w:rPr>
+        <w:t>{/achievements}</w:t>
+      </w:r>
+    </w:p>
+    <w:p>
+      <w:pPr>
+        <w:tabs>
+          <w:tab w:val="right" w:pos="10080"/>
+        </w:tabs>
+        <w:rPr>
+          <w:rFonts w:cstheme="minorHAnsi"/>
+          <w:color w:val="363A45" w:themeColor="text1" w:themeTint="E6"/>
+          <w:sz w:val="10"/>
+          <w:szCs w:val="10"/>
+        </w:rPr>
+      </w:pPr>
+      <w:r>
+        <w:rPr>
+          <w:rFonts w:cstheme="minorHAnsi"/>
+          <w:color w:val="363A45" w:themeColor="text1" w:themeTint="E6"/>
+          <w:sz w:val="10"/>
+          <w:szCs w:val="10"/>
+        </w:rPr>
         <w:t>{/</w:t>
       </w:r>
-      <w:proofErr w:type="gramStart"/>
-      <w:r>
-        <w:rPr>
-          <w:rFonts w:cstheme="minorHAnsi"/>
-          <w:color w:val="363A45" w:themeColor="text1" w:themeTint="E6"/>
-        </w:rPr>
-        <w:t>achievements}</w:t>
-      </w:r>
-      <w:r>
-        <w:rPr>
-          <w:rFonts w:cstheme="minorHAnsi"/>
-          <w:color w:val="363A45" w:themeColor="text1" w:themeTint="E6"/>
-        </w:rPr>
-        <w:t>{</w:t>
-      </w:r>
-      <w:proofErr w:type="gramEnd"/>
-      <w:r>
-        <w:rPr>
-          <w:rFonts w:cstheme="minorHAnsi"/>
-          <w:color w:val="363A45" w:themeColor="text1" w:themeTint="E6"/>
-        </w:rPr>
-        <w:t>/</w:t>
-      </w:r>
       <w:proofErr w:type="spellStart"/>
       <w:r>
         <w:rPr>
           <w:rFonts w:cstheme="minorHAnsi"/>
           <w:color w:val="363A45" w:themeColor="text1" w:themeTint="E6"/>
+          <w:sz w:val="10"/>
+          <w:szCs w:val="10"/>
         </w:rPr>
         <w:t>showAchievements</w:t>
       </w:r>
@@ -496,6 +497,8 @@
         <w:rPr>
           <w:rFonts w:cstheme="minorHAnsi"/>
           <w:color w:val="363A45" w:themeColor="text1" w:themeTint="E6"/>
+          <w:sz w:val="10"/>
+          <w:szCs w:val="10"/>
         </w:rPr>
         <w:t>}</w:t>
       </w:r>

</xml_diff>